<commit_message>
Add second author and affiliations (HIT; Afeka)
Authors: Alexander Apartsin (School of Computer Science, Faculty of Sciences,
Holon Institute of Technology, Holon, Israel) and Yehudit Aperstein
(Intelligent Systems, Afeka Academic College of Engineering, Tel-Aviv, Israel).
Superscript-linked byline + affiliations block with matching CSS.

Co-Authored-By: Claude Opus 4.7 <noreply@anthropic.com>
</commit_message>
<xml_diff>
--- a/docs/paper.docx
+++ b/docs/paper.docx
@@ -71,13 +71,71 @@
       <w:r>
         <w:t xml:space="preserve">Apartsin</w:t>
       </w:r>
+      <w:r>
+        <w:rPr>
+          <w:vertAlign w:val="superscript"/>
+        </w:rPr>
+        <w:t xml:space="preserve">1</w:t>
+      </w:r>
+    </w:p>
+    <w:p>
+      <w:pPr>
+        <w:pStyle w:val="Author"/>
+      </w:pPr>
+      <w:r>
+        <w:t xml:space="preserve">Yehudit</w:t>
+      </w:r>
+      <w:r>
+        <w:t xml:space="preserve"> </w:t>
+      </w:r>
+      <w:r>
+        <w:t xml:space="preserve">Aperstein</w:t>
+      </w:r>
+      <w:r>
+        <w:rPr>
+          <w:vertAlign w:val="superscript"/>
+        </w:rPr>
+        <w:t xml:space="preserve">2</w:t>
+      </w:r>
     </w:p>
     <w:p>
       <w:pPr>
         <w:pStyle w:val="Date"/>
       </w:pPr>
       <w:r>
-        <w:t xml:space="preserve">2026-08-29</w:t>
+        <w:t xml:space="preserve">2026-08-30</w:t>
+      </w:r>
+    </w:p>
+    <w:p>
+      <w:pPr>
+        <w:pStyle w:val="FirstParagraph"/>
+      </w:pPr>
+      <w:r>
+        <w:rPr>
+          <w:vertAlign w:val="superscript"/>
+        </w:rPr>
+        <w:t xml:space="preserve">1</w:t>
+      </w:r>
+      <w:r>
+        <w:t xml:space="preserve"> </w:t>
+      </w:r>
+      <w:r>
+        <w:t xml:space="preserve">School of Computer Science, Faculty of Sciences, Holon Institute of Technology (HIT), Holon, Israel</w:t>
+      </w:r>
+      <w:r>
+        <w:br/>
+      </w:r>
+      <w:r>
+        <w:rPr>
+          <w:vertAlign w:val="superscript"/>
+        </w:rPr>
+        <w:t xml:space="preserve">2</w:t>
+      </w:r>
+      <w:r>
+        <w:t xml:space="preserve"> </w:t>
+      </w:r>
+      <w:r>
+        <w:t xml:space="preserve">Intelligent Systems, Afeka Academic College of Engineering, Tel-Aviv, Israel</w:t>
       </w:r>
     </w:p>
     <w:bookmarkStart w:id="20" w:name="abstract"/>

</xml_diff>

<commit_message>
Honest baseline framing (W3): mined patterns sit on the accuracy-interpretability frontier
Added the strong-baseline comparison the review asked for. On Azure last5 a
gradient-boosted count model and a binary-bigram LR both reach 0.845, above the
mined-itemset features (0.778); on Alibaba last3 the GBM count model reaches
0.883 vs 0.695. Stated forward: the mined patterns' value is validated,
human-readable, decomposition-exposing signatures, not a maximal held-out
score (which a count-vector GBM already achieves). wins-only clean, audit
128/128, 0 em-dashes.

Co-Authored-By: Claude Opus 4.7 <noreply@anthropic.com>
</commit_message>
<xml_diff>
--- a/docs/paper.docx
+++ b/docs/paper.docx
@@ -9120,6 +9120,116 @@
       </w:r>
       <w:r>
         <w:t xml:space="preserve">the floor.</w:t>
+      </w:r>
+    </w:p>
+    <w:p>
+      <w:pPr>
+        <w:pStyle w:val="BodyText"/>
+      </w:pPr>
+      <w:r>
+        <w:t xml:space="preserve">Against non-degenerate baselines the mined-pattern features do not win</w:t>
+      </w:r>
+      <w:r>
+        <w:t xml:space="preserve"> </w:t>
+      </w:r>
+      <w:r>
+        <w:t xml:space="preserve">on raw accuracy, and we do not claim they do. On Azure</w:t>
+      </w:r>
+      <w:r>
+        <w:t xml:space="preserve"> </w:t>
+      </w:r>
+      <w:r>
+        <w:rPr>
+          <w:rStyle w:val="VerbatimChar"/>
+        </w:rPr>
+        <w:t xml:space="preserve">last5</w:t>
+      </w:r>
+      <w:r>
+        <w:t xml:space="preserve"> </w:t>
+      </w:r>
+      <w:r>
+        <w:t xml:space="preserve">a</w:t>
+      </w:r>
+      <w:r>
+        <w:t xml:space="preserve"> </w:t>
+      </w:r>
+      <w:r>
+        <w:t xml:space="preserve">gradient-boosted model on event counts and a binary-bigram logistic</w:t>
+      </w:r>
+      <w:r>
+        <w:t xml:space="preserve"> </w:t>
+      </w:r>
+      <w:r>
+        <w:t xml:space="preserve">regression both reach AUROC 0.845, above the mined-itemset features</w:t>
+      </w:r>
+      <w:r>
+        <w:t xml:space="preserve"> </w:t>
+      </w:r>
+      <w:r>
+        <w:t xml:space="preserve">(0.778); on Alibaba</w:t>
+      </w:r>
+      <w:r>
+        <w:t xml:space="preserve"> </w:t>
+      </w:r>
+      <w:r>
+        <w:rPr>
+          <w:rStyle w:val="VerbatimChar"/>
+        </w:rPr>
+        <w:t xml:space="preserve">last3</w:t>
+      </w:r>
+      <w:r>
+        <w:t xml:space="preserve"> </w:t>
+      </w:r>
+      <w:r>
+        <w:t xml:space="preserve">the gradient-boosted count model reaches</w:t>
+      </w:r>
+      <w:r>
+        <w:t xml:space="preserve"> </w:t>
+      </w:r>
+      <w:r>
+        <w:t xml:space="preserve">0.883, well above the mined-itemset features (0.695). The recency</w:t>
+      </w:r>
+      <w:r>
+        <w:t xml:space="preserve"> </w:t>
+      </w:r>
+      <w:r>
+        <w:t xml:space="preserve">baseline (event count plus window time span) stays near 0.57-0.70. The</w:t>
+      </w:r>
+      <w:r>
+        <w:t xml:space="preserve"> </w:t>
+      </w:r>
+      <w:r>
+        <w:t xml:space="preserve">value of the mined patterns is therefore not that they maximise a</w:t>
+      </w:r>
+      <w:r>
+        <w:t xml:space="preserve"> </w:t>
+      </w:r>
+      <w:r>
+        <w:t xml:space="preserve">held-out score, which a count-vector gradient-boosted model already</w:t>
+      </w:r>
+      <w:r>
+        <w:t xml:space="preserve"> </w:t>
+      </w:r>
+      <w:r>
+        <w:t xml:space="preserve">does, but that they are human-readable, individually</w:t>
+      </w:r>
+      <w:r>
+        <w:t xml:space="preserve"> </w:t>
+      </w:r>
+      <w:r>
+        <w:t xml:space="preserve">significance-tested signatures that occupy a specific point on the</w:t>
+      </w:r>
+      <w:r>
+        <w:t xml:space="preserve"> </w:t>
+      </w:r>
+      <w:r>
+        <w:t xml:space="preserve">accuracy-interpretability frontier and expose the presence /</w:t>
+      </w:r>
+      <w:r>
+        <w:t xml:space="preserve"> </w:t>
+      </w:r>
+      <w:r>
+        <w:t xml:space="preserve">multiplicity / order structure a black-box score hides.</w:t>
       </w:r>
     </w:p>
     <w:tbl>

</xml_diff>

<commit_message>
Structural polish: promote cloud/HPC/automotive catalog to §6.7 (out from under calibration)
Fable must-fix 5: the continuation of the signature catalog (Azure, Alibaba,
SCANIA, BGL entries) was nested as §6.6.1 under §6.6 'Case-control ratio and
posterior', a calibration digression. Promoted it to a proper section §6.7
'Signature catalog: cloud, HPC, and automotive traces'; shifted §6.7-6.11 to
§6.8-6.12 and updated every cross-reference and the §6 roadmap range.

Also parameterized scripts/degradation_chain_catalog.py (--hours/--maxlen/--out)
for the 72h horizon sweep.

Section refs all resolve. Numbers audit 133/133. Paper rebuilt.

Co-Authored-By: Claude Opus 4.7 <noreply@anthropic.com>
</commit_message>
<xml_diff>
--- a/docs/paper.docx
+++ b/docs/paper.docx
@@ -5714,7 +5714,7 @@
         <w:t xml:space="preserve"> </w:t>
       </w:r>
       <w:r>
-        <w:t xml:space="preserve">inference-half estimate (§6.10) is a top HR of 1.60 [1.35, 1.91].</w:t>
+        <w:t xml:space="preserve">inference-half estimate (§6.11) is a top HR of 1.60 [1.35, 1.91].</w:t>
       </w:r>
     </w:p>
     <w:bookmarkEnd w:id="42"/>
@@ -14640,7 +14640,7 @@
       </w:r>
     </w:p>
     <w:bookmarkEnd w:id="53"/>
-    <w:bookmarkStart w:id="55" w:name="X440c656fb7d773359d66b076a99a88b700cb867"/>
+    <w:bookmarkStart w:id="54" w:name="X440c656fb7d773359d66b076a99a88b700cb867"/>
     <w:p>
       <w:pPr>
         <w:pStyle w:val="Heading3"/>
@@ -15169,13 +15169,14 @@
         <w:t xml:space="preserve">of 0.89 nor the operational PPV of 0.20 suffices alone.</w:t>
       </w:r>
     </w:p>
-    <w:bookmarkStart w:id="54" w:name="X5f409ab5bc0cacb368394f2fe592924467a43a9"/>
-    <w:p>
-      <w:pPr>
-        <w:pStyle w:val="Heading4"/>
-      </w:pPr>
-      <w:r>
-        <w:t xml:space="preserve">6.6.1 Signature catalog: cloud, HPC, and automotive traces</w:t>
+    <w:bookmarkEnd w:id="54"/>
+    <w:bookmarkStart w:id="55" w:name="X5f409ab5bc0cacb368394f2fe592924467a43a9"/>
+    <w:p>
+      <w:pPr>
+        <w:pStyle w:val="Heading3"/>
+      </w:pPr>
+      <w:r>
+        <w:t xml:space="preserve">6.7 Signature catalog: cloud, HPC, and automotive traces</w:t>
       </w:r>
     </w:p>
     <w:p>
@@ -16300,7 +16301,7 @@
         <w:t xml:space="preserve"> </w:t>
       </w:r>
       <w:r>
-        <w:t xml:space="preserve">and base-rate dependent (§6.8). Longer patterns add no signal beyond</w:t>
+        <w:t xml:space="preserve">and base-rate dependent (§6.9). Longer patterns add no signal beyond</w:t>
       </w:r>
       <w:r>
         <w:t xml:space="preserve"> </w:t>
@@ -16399,7 +16400,7 @@
         <w:t xml:space="preserve"> </w:t>
       </w:r>
       <w:r>
-        <w:t xml:space="preserve">half (§6.10); the top five inference-half hazard ratios are listed</w:t>
+        <w:t xml:space="preserve">half (§6.11); the top five inference-half hazard ratios are listed</w:t>
       </w:r>
       <w:r>
         <w:t xml:space="preserve"> </w:t>
@@ -16731,34 +16732,33 @@
         <w:pStyle w:val="BodyText"/>
       </w:pPr>
       <w:r>
-        <w:t xml:space="preserve">Sections 6.7 through 6.11 present the aggregate evidence behind these</w:t>
-      </w:r>
-      <w:r>
-        <w:t xml:space="preserve"> </w:t>
-      </w:r>
-      <w:r>
-        <w:t xml:space="preserve">signatures: the predictive-vs-frequent-noise separation (§6.7),</w:t>
-      </w:r>
-      <w:r>
-        <w:t xml:space="preserve"> </w:t>
-      </w:r>
-      <w:r>
-        <w:t xml:space="preserve">post-selection-valid sequence significance (§6.8), the same-sample</w:t>
-      </w:r>
-      <w:r>
-        <w:t xml:space="preserve"> </w:t>
-      </w:r>
-      <w:r>
-        <w:t xml:space="preserve">marginal baseline (§6.9), the SCANIA matched hazard-ratio analysis</w:t>
-      </w:r>
-      <w:r>
-        <w:t xml:space="preserve"> </w:t>
-      </w:r>
-      <w:r>
-        <w:t xml:space="preserve">(§6.10), and lead time on true positives (§6.11).</w:t>
-      </w:r>
-    </w:p>
-    <w:bookmarkEnd w:id="54"/>
+        <w:t xml:space="preserve">Sections 6.8 through 6.12 present the aggregate evidence behind these</w:t>
+      </w:r>
+      <w:r>
+        <w:t xml:space="preserve"> </w:t>
+      </w:r>
+      <w:r>
+        <w:t xml:space="preserve">signatures: the predictive-vs-frequent-noise separation (§6.8),</w:t>
+      </w:r>
+      <w:r>
+        <w:t xml:space="preserve"> </w:t>
+      </w:r>
+      <w:r>
+        <w:t xml:space="preserve">post-selection-valid sequence significance (§6.9), the same-sample</w:t>
+      </w:r>
+      <w:r>
+        <w:t xml:space="preserve"> </w:t>
+      </w:r>
+      <w:r>
+        <w:t xml:space="preserve">marginal baseline (§6.10), the SCANIA matched hazard-ratio analysis</w:t>
+      </w:r>
+      <w:r>
+        <w:t xml:space="preserve"> </w:t>
+      </w:r>
+      <w:r>
+        <w:t xml:space="preserve">(§6.11), and lead time on true positives (§6.12).</w:t>
+      </w:r>
+    </w:p>
     <w:bookmarkEnd w:id="55"/>
     <w:bookmarkStart w:id="56" w:name="X44aeb5833a19b6d32b8998867e975190f65e5f8"/>
     <w:p>
@@ -16766,7 +16766,7 @@
         <w:pStyle w:val="Heading3"/>
       </w:pPr>
       <w:r>
-        <w:t xml:space="preserve">6.7 Predictive vs frequent-noise separation across traces</w:t>
+        <w:t xml:space="preserve">6.8 Predictive vs frequent-noise separation across traces</w:t>
       </w:r>
     </w:p>
     <w:p>
@@ -18168,7 +18168,7 @@
         <w:t xml:space="preserve"> </w:t>
       </w:r>
       <w:r>
-        <w:t xml:space="preserve">conditional-logistic analysis in §6.10 instead. On Azure and Alibaba</w:t>
+        <w:t xml:space="preserve">conditional-logistic analysis in §6.11 instead. On Azure and Alibaba</w:t>
       </w:r>
       <w:r>
         <w:t xml:space="preserve"> </w:t>
@@ -18196,7 +18196,7 @@
         <w:pStyle w:val="Heading3"/>
       </w:pPr>
       <w:r>
-        <w:t xml:space="preserve">6.8 Post-selection-valid sequence significance and closed-sequence compression</w:t>
+        <w:t xml:space="preserve">6.9 Post-selection-valid sequence significance and closed-sequence compression</w:t>
       </w:r>
     </w:p>
     <w:p>
@@ -19638,7 +19638,7 @@
         <w:pStyle w:val="Heading3"/>
       </w:pPr>
       <w:r>
-        <w:t xml:space="preserve">6.9 Formal significance (same-sample marginal counts)</w:t>
+        <w:t xml:space="preserve">6.10 Formal significance (same-sample marginal counts)</w:t>
       </w:r>
     </w:p>
     <w:p>
@@ -19670,7 +19670,7 @@
         <w:t xml:space="preserve"> </w:t>
       </w:r>
       <w:r>
-        <w:t xml:space="preserve">counts in §6.7 and §6.8 is the size of the selection artefact. At</w:t>
+        <w:t xml:space="preserve">counts in §6.8 and §6.9 is the size of the selection artefact. At</w:t>
       </w:r>
       <w:r>
         <w:t xml:space="preserve"> </w:t>
@@ -19806,7 +19806,7 @@
         <w:pStyle w:val="Heading3"/>
       </w:pPr>
       <w:r>
-        <w:t xml:space="preserve">6.10 SCANIA risk-set matched patterns (Component X)</w:t>
+        <w:t xml:space="preserve">6.11 SCANIA risk-set matched patterns (Component X)</w:t>
       </w:r>
     </w:p>
     <w:p>
@@ -21144,7 +21144,7 @@
         <w:pStyle w:val="Heading3"/>
       </w:pPr>
       <w:r>
-        <w:t xml:space="preserve">6.11 Lead time on true positives</w:t>
+        <w:t xml:space="preserve">6.12 Lead time on true positives</w:t>
       </w:r>
     </w:p>
     <w:p>
@@ -23112,7 +23112,7 @@
         <w:pStyle w:val="BodyText"/>
       </w:pPr>
       <w:r>
-        <w:t xml:space="preserve">The two lead-time regimes in §6.11 speak to deployment. Azure inherits</w:t>
+        <w:t xml:space="preserve">The two lead-time regimes in §6.12 speak to deployment. Azure inherits</w:t>
       </w:r>
       <w:r>
         <w:t xml:space="preserve"> </w:t>

</xml_diff>

<commit_message>
Extend presence/multiplicity/order decomposition to all six traces (wind farms = pure presence)
Ran the decomposition on Kelmarsh and Penmanshiel too. Both wind farms are
pure presence: presence effect +0.244 (Kelmarsh) and +0.326 (Penmanshiel),
large with CIs far from zero, while multiplicity and order increments are both
indistinguishable from zero. This is the decomposition's account of the
co-located burst, and it is why the search for ordered degradation trajectories
returns so little: there is no order channel on the wind farms to begin with.

The six-trace decomposition now reads as three clean regimes: wind farms have a
large presence base and no further channel; Azure and Alibaba have a presence
base plus exactly one further channel each (order / multiplicity); BGL and
SCANIA have no usable presence base. Table 3 and Figure 6 updated to six rows;
audit +4 checks (139/139).

wins-only clean. 0 em-dashes.

Co-Authored-By: Claude Opus 4.7 <noreply@anthropic.com>
</commit_message>
<xml_diff>
--- a/docs/paper.docx
+++ b/docs/paper.docx
@@ -8784,6 +8784,114 @@
               <w:jc w:val="left"/>
             </w:pPr>
             <w:r>
+              <w:t xml:space="preserve">Kelmarsh</w:t>
+            </w:r>
+          </w:p>
+        </w:tc>
+        <w:tc>
+          <w:tcPr/>
+          <w:p>
+            <w:pPr>
+              <w:pStyle w:val="Compact"/>
+              <w:jc w:val="right"/>
+            </w:pPr>
+            <w:r>
+              <w:rPr>
+                <w:b/>
+                <w:bCs/>
+              </w:rPr>
+              <w:t xml:space="preserve">+0.244 [0.195, 0.315]</w:t>
+            </w:r>
+          </w:p>
+        </w:tc>
+        <w:tc>
+          <w:tcPr/>
+          <w:p>
+            <w:pPr>
+              <w:pStyle w:val="Compact"/>
+              <w:jc w:val="right"/>
+            </w:pPr>
+            <w:r>
+              <w:t xml:space="preserve">-0.004 [-0.038, 0.021]</w:t>
+            </w:r>
+          </w:p>
+        </w:tc>
+        <w:tc>
+          <w:tcPr/>
+          <w:p>
+            <w:pPr>
+              <w:pStyle w:val="Compact"/>
+              <w:jc w:val="right"/>
+            </w:pPr>
+            <w:r>
+              <w:t xml:space="preserve">-0.018 [-0.023, 0.002]</w:t>
+            </w:r>
+          </w:p>
+        </w:tc>
+      </w:tr>
+      <w:tr>
+        <w:tc>
+          <w:tcPr/>
+          <w:p>
+            <w:pPr>
+              <w:pStyle w:val="Compact"/>
+              <w:jc w:val="left"/>
+            </w:pPr>
+            <w:r>
+              <w:t xml:space="preserve">Penmanshiel</w:t>
+            </w:r>
+          </w:p>
+        </w:tc>
+        <w:tc>
+          <w:tcPr/>
+          <w:p>
+            <w:pPr>
+              <w:pStyle w:val="Compact"/>
+              <w:jc w:val="right"/>
+            </w:pPr>
+            <w:r>
+              <w:rPr>
+                <w:b/>
+                <w:bCs/>
+              </w:rPr>
+              <w:t xml:space="preserve">+0.326 [0.282, 0.374]</w:t>
+            </w:r>
+          </w:p>
+        </w:tc>
+        <w:tc>
+          <w:tcPr/>
+          <w:p>
+            <w:pPr>
+              <w:pStyle w:val="Compact"/>
+              <w:jc w:val="right"/>
+            </w:pPr>
+            <w:r>
+              <w:t xml:space="preserve">+0.003 [-0.016, 0.023]</w:t>
+            </w:r>
+          </w:p>
+        </w:tc>
+        <w:tc>
+          <w:tcPr/>
+          <w:p>
+            <w:pPr>
+              <w:pStyle w:val="Compact"/>
+              <w:jc w:val="right"/>
+            </w:pPr>
+            <w:r>
+              <w:t xml:space="preserve">+0.002 [-0.048, 0.037]</w:t>
+            </w:r>
+          </w:p>
+        </w:tc>
+      </w:tr>
+      <w:tr>
+        <w:tc>
+          <w:tcPr/>
+          <w:p>
+            <w:pPr>
+              <w:pStyle w:val="Compact"/>
+              <w:jc w:val="left"/>
+            </w:pPr>
+            <w:r>
               <w:t xml:space="preserve">Azure</w:t>
             </w:r>
           </w:p>
@@ -8989,7 +9097,7 @@
         <w:pStyle w:val="BodyText"/>
       </w:pPr>
       <w:r>
-        <w:t xml:space="preserve">On both positive traces the largest lever is event</w:t>
+        <w:t xml:space="preserve">The decomposition separates the traces into three clean regimes.</w:t>
       </w:r>
       <w:r>
         <w:t xml:space="preserve"> </w:t>
@@ -8999,25 +9107,49 @@
           <w:b/>
           <w:bCs/>
         </w:rPr>
-        <w:t xml:space="preserve">presence</w:t>
-      </w:r>
-      <w:r>
-        <w:t xml:space="preserve"> </w:t>
-      </w:r>
-      <w:r>
-        <w:t xml:space="preserve">(which</w:t>
-      </w:r>
-      <w:r>
-        <w:t xml:space="preserve"> </w:t>
-      </w:r>
-      <w:r>
-        <w:t xml:space="preserve">event types occur at all: +0.30 on Azure, +0.15 on Alibaba). What</w:t>
-      </w:r>
-      <w:r>
-        <w:t xml:space="preserve"> </w:t>
-      </w:r>
-      <w:r>
-        <w:t xml:space="preserve">distinguishes them is the second channel.</w:t>
+        <w:t xml:space="preserve">On the two wind farms the entire signal is event presence</w:t>
+      </w:r>
+      <w:r>
+        <w:t xml:space="preserve"> </w:t>
+      </w:r>
+      <w:r>
+        <w:t xml:space="preserve">(+0.244 on Kelmarsh, +0.326 on Penmanshiel, both large and with CIs</w:t>
+      </w:r>
+      <w:r>
+        <w:t xml:space="preserve"> </w:t>
+      </w:r>
+      <w:r>
+        <w:t xml:space="preserve">far from zero), and both the multiplicity and order increments are</w:t>
+      </w:r>
+      <w:r>
+        <w:t xml:space="preserve"> </w:t>
+      </w:r>
+      <w:r>
+        <w:t xml:space="preserve">indistinguishable from zero: which alarm codes occur is what predicts</w:t>
+      </w:r>
+      <w:r>
+        <w:t xml:space="preserve"> </w:t>
+      </w:r>
+      <w:r>
+        <w:t xml:space="preserve">the outage, not how many times or in what order. This is the</w:t>
+      </w:r>
+      <w:r>
+        <w:t xml:space="preserve"> </w:t>
+      </w:r>
+      <w:r>
+        <w:t xml:space="preserve">decomposition’s account of the co-located burst, and it is exactly why</w:t>
+      </w:r>
+      <w:r>
+        <w:t xml:space="preserve"> </w:t>
+      </w:r>
+      <w:r>
+        <w:t xml:space="preserve">the search for ordered degradation trajectories below returns so</w:t>
+      </w:r>
+      <w:r>
+        <w:t xml:space="preserve"> </w:t>
+      </w:r>
+      <w:r>
+        <w:t xml:space="preserve">little.</w:t>
       </w:r>
       <w:r>
         <w:t xml:space="preserve"> </w:t>
@@ -9027,7 +9159,7 @@
           <w:b/>
           <w:bCs/>
         </w:rPr>
-        <w:t xml:space="preserve">On Azure the order</w:t>
+        <w:t xml:space="preserve">On Azure and Alibaba a large presence effect is joined by</w:t>
       </w:r>
       <w:r>
         <w:rPr>
@@ -9041,7 +9173,7 @@
           <w:b/>
           <w:bCs/>
         </w:rPr>
-        <w:t xml:space="preserve">increment is +0.032 with a CI that excludes zero while the</w:t>
+        <w:t xml:space="preserve">exactly one further channel: order on Azure (+0.032, CI excludes</w:t>
       </w:r>
       <w:r>
         <w:rPr>
@@ -9055,7 +9187,7 @@
           <w:b/>
           <w:bCs/>
         </w:rPr>
-        <w:t xml:space="preserve">multiplicity increment does not; on Alibaba the reverse holds, a</w:t>
+        <w:t xml:space="preserve">zero, multiplicity does not), multiplicity on Alibaba (+0.029,</w:t>
       </w:r>
       <w:r>
         <w:rPr>
@@ -9069,63 +9201,37 @@
           <w:b/>
           <w:bCs/>
         </w:rPr>
-        <w:t xml:space="preserve">multiplicity increment of +0.029 excluding zero and an order increment</w:t>
-      </w:r>
-      <w:r>
-        <w:rPr>
-          <w:b/>
-          <w:bCs/>
-        </w:rPr>
-        <w:t xml:space="preserve"> </w:t>
-      </w:r>
-      <w:r>
-        <w:rPr>
-          <w:b/>
-          <w:bCs/>
-        </w:rPr>
-        <w:t xml:space="preserve">indistinguishable from zero</w:t>
-      </w:r>
-      <w:r>
-        <w:t xml:space="preserve"> </w:t>
-      </w:r>
-      <w:r>
-        <w:t xml:space="preserve">(Figure 6). The two positive traces</w:t>
-      </w:r>
-      <w:r>
-        <w:t xml:space="preserve"> </w:t>
-      </w:r>
-      <w:r>
-        <w:t xml:space="preserve">therefore occupy opposite corners of the decomposition: Azure carries</w:t>
-      </w:r>
-      <w:r>
-        <w:t xml:space="preserve"> </w:t>
-      </w:r>
-      <w:r>
-        <w:t xml:space="preserve">a genuine ordering signal, Alibaba a multiplicity signal that binary</w:t>
-      </w:r>
-      <w:r>
-        <w:t xml:space="preserve"> </w:t>
-      </w:r>
-      <w:r>
-        <w:t xml:space="preserve">itemsets discard but exact order does not recover. This resolves the</w:t>
-      </w:r>
-      <w:r>
-        <w:t xml:space="preserve"> </w:t>
-      </w:r>
-      <w:r>
-        <w:t xml:space="preserve">apparent tension with the count-preserving lift analysis below: the</w:t>
-      </w:r>
-      <w:r>
-        <w:t xml:space="preserve"> </w:t>
-      </w:r>
-      <w:r>
-        <w:t xml:space="preserve">Alibaba sequence advantage is repeated-event information, not exact</w:t>
-      </w:r>
-      <w:r>
-        <w:t xml:space="preserve"> </w:t>
-      </w:r>
-      <w:r>
-        <w:t xml:space="preserve">within-window order.</w:t>
+        <w:t xml:space="preserve">excludes zero, order does not)</w:t>
+      </w:r>
+      <w:r>
+        <w:t xml:space="preserve"> </w:t>
+      </w:r>
+      <w:r>
+        <w:t xml:space="preserve">(Figure 6). Azure carries a genuine</w:t>
+      </w:r>
+      <w:r>
+        <w:t xml:space="preserve"> </w:t>
+      </w:r>
+      <w:r>
+        <w:t xml:space="preserve">ordering signal; Alibaba a multiplicity signal that binary itemsets</w:t>
+      </w:r>
+      <w:r>
+        <w:t xml:space="preserve"> </w:t>
+      </w:r>
+      <w:r>
+        <w:t xml:space="preserve">discard but exact order does not recover, which resolves the tension</w:t>
+      </w:r>
+      <w:r>
+        <w:t xml:space="preserve"> </w:t>
+      </w:r>
+      <w:r>
+        <w:t xml:space="preserve">with the count-preserving lift analysis below (the Alibaba sequence</w:t>
+      </w:r>
+      <w:r>
+        <w:t xml:space="preserve"> </w:t>
+      </w:r>
+      <w:r>
+        <w:t xml:space="preserve">advantage is repeated-event information, not exact order).</w:t>
       </w:r>
     </w:p>
     <w:p>
@@ -9205,13 +9311,25 @@
         <w:t xml:space="preserve"> </w:t>
       </w:r>
       <w:r>
-        <w:t xml:space="preserve">single CI; only Azure and Alibaba combine a large presence effect with</w:t>
-      </w:r>
-      <w:r>
-        <w:t xml:space="preserve"> </w:t>
-      </w:r>
-      <w:r>
-        <w:t xml:space="preserve">exactly one further channel that excludes zero.</w:t>
+        <w:t xml:space="preserve">single CI: the two wind farms have a large presence base and no</w:t>
+      </w:r>
+      <w:r>
+        <w:t xml:space="preserve"> </w:t>
+      </w:r>
+      <w:r>
+        <w:t xml:space="preserve">further channel, Azure and Alibaba have a large presence base and</w:t>
+      </w:r>
+      <w:r>
+        <w:t xml:space="preserve"> </w:t>
+      </w:r>
+      <w:r>
+        <w:t xml:space="preserve">exactly one further channel each, and BGL and SCANIA have no usable</w:t>
+      </w:r>
+      <w:r>
+        <w:t xml:space="preserve"> </w:t>
+      </w:r>
+      <w:r>
+        <w:t xml:space="preserve">presence base for any channel to build on.</w:t>
       </w:r>
     </w:p>
     <w:p>
@@ -9395,7 +9513,7 @@
               <w:t xml:space="preserve"> </w:t>
             </w:r>
             <w:r>
-              <w:t xml:space="preserve">Presence / multiplicity / order decomposition of held-out AUROC per trace, with entity-bootstrap 95% CIs. Solid bars have a CI excluding zero; hatched bars are indistinguishable from no effect. Azure’s distinguishing increment is order; Alibaba’s is multiplicity.</w:t>
+              <w:t xml:space="preserve">Presence / multiplicity / order decomposition of held-out AUROC across all six traces, with entity-bootstrap 95% CIs. Solid bars have a CI excluding zero; hatched bars are indistinguishable from no effect. The two wind farms are pure presence; Azure adds an order increment, Alibaba a multiplicity increment; BGL and SCANIA have no usable presence base.</w:t>
             </w:r>
           </w:p>
         </w:tc>
@@ -9416,7 +9534,7 @@
         <w:t xml:space="preserve"> </w:t>
       </w:r>
       <w:r>
-        <w:t xml:space="preserve">Presence / multiplicity / order decomposition of held-out AUROC per trace, with entity-bootstrap 95% CIs. Solid bars have a CI excluding zero; hatched bars are indistinguishable from no effect. Azure’s distinguishing increment is order; Alibaba’s is multiplicity.</w:t>
+        <w:t xml:space="preserve">Presence / multiplicity / order decomposition of held-out AUROC across all six traces, with entity-bootstrap 95% CIs. Solid bars have a CI excluding zero; hatched bars are indistinguishable from no effect. The two wind farms are pure presence; Azure adds an order increment, Alibaba a multiplicity increment; BGL and SCANIA have no usable presence base.</w:t>
       </w:r>
     </w:p>
     <w:p>

</xml_diff>